<commit_message>
Work Knowledge - 10/23/2025
</commit_message>
<xml_diff>
--- a/Knowledge/1-Academic/Academic Collection.docx
+++ b/Knowledge/1-Academic/Academic Collection.docx
@@ -177,6 +177,15 @@
       <w:r>
         <w:t>2-College</w:t>
       </w:r>
+      <w:r>
+        <w:t xml:space="preserve"> (</w:t>
+      </w:r>
+      <w:r>
+        <w:t>Total 9</w:t>
+      </w:r>
+      <w:r>
+        <w:t>)</w:t>
+      </w:r>
     </w:p>
     <w:p>
       <w:pPr>
@@ -186,10 +195,7 @@
         <w:t>1-Modern academy - 2017-2018</w:t>
       </w:r>
       <w:r>
-        <w:t xml:space="preserve"> </w:t>
-      </w:r>
-      <w:r>
-        <w:t>(Total 9)</w:t>
+        <w:t xml:space="preserve"> (Total 9)</w:t>
       </w:r>
     </w:p>
     <w:p>

</xml_diff>